<commit_message>
Add on-premise Docker deployment package
</commit_message>
<xml_diff>
--- a/docs/word/readme.docx
+++ b/docs/word/readme.docx
@@ -774,6 +774,637 @@
           </w:p>
         </w:tc>
       </w:tr>
+      <w:tr>
+        <w:tc>
+          <w:tcPr>
+            <w:tcW w:type="dxa" w:w="3331"/>
+            <w:tcBorders>
+              <w:top w:val="single" w:sz="4" w:space="0" w:color="B7C9D6"/>
+              <w:left w:val="single" w:sz="4" w:space="0" w:color="B7C9D6"/>
+              <w:bottom w:val="single" w:sz="4" w:space="0" w:color="B7C9D6"/>
+              <w:right w:val="single" w:sz="4" w:space="0" w:color="B7C9D6"/>
+              <w:insideH w:val="single" w:sz="4" w:space="0" w:color="B7C9D6"/>
+              <w:insideV w:val="single" w:sz="4" w:space="0" w:color="B7C9D6"/>
+            </w:tcBorders>
+            <w:vAlign w:val="center"/>
+          </w:tcPr>
+          <w:p>
+            <w:pPr>
+              <w:spacing w:after="0"/>
+            </w:pPr>
+            <w:r>
+              <w:rPr>
+                <w:b w:val="0"/>
+              </w:rPr>
+              <w:t>On-Premise Deployment</w:t>
+            </w:r>
+          </w:p>
+        </w:tc>
+        <w:tc>
+          <w:tcPr>
+            <w:tcW w:type="dxa" w:w="3331"/>
+            <w:tcBorders>
+              <w:top w:val="single" w:sz="4" w:space="0" w:color="B7C9D6"/>
+              <w:left w:val="single" w:sz="4" w:space="0" w:color="B7C9D6"/>
+              <w:bottom w:val="single" w:sz="4" w:space="0" w:color="B7C9D6"/>
+              <w:right w:val="single" w:sz="4" w:space="0" w:color="B7C9D6"/>
+              <w:insideH w:val="single" w:sz="4" w:space="0" w:color="B7C9D6"/>
+              <w:insideV w:val="single" w:sz="4" w:space="0" w:color="B7C9D6"/>
+            </w:tcBorders>
+            <w:vAlign w:val="center"/>
+          </w:tcPr>
+          <w:p>
+            <w:pPr>
+              <w:spacing w:after="0"/>
+            </w:pPr>
+            <w:r>
+              <w:rPr>
+                <w:b w:val="0"/>
+              </w:rPr>
+              <w:t>IT admins, implementation partners, support</w:t>
+            </w:r>
+          </w:p>
+        </w:tc>
+        <w:tc>
+          <w:tcPr>
+            <w:tcW w:type="dxa" w:w="3331"/>
+            <w:tcBorders>
+              <w:top w:val="single" w:sz="4" w:space="0" w:color="B7C9D6"/>
+              <w:left w:val="single" w:sz="4" w:space="0" w:color="B7C9D6"/>
+              <w:bottom w:val="single" w:sz="4" w:space="0" w:color="B7C9D6"/>
+              <w:right w:val="single" w:sz="4" w:space="0" w:color="B7C9D6"/>
+              <w:insideH w:val="single" w:sz="4" w:space="0" w:color="B7C9D6"/>
+              <w:insideV w:val="single" w:sz="4" w:space="0" w:color="B7C9D6"/>
+            </w:tcBorders>
+            <w:vAlign w:val="center"/>
+          </w:tcPr>
+          <w:p>
+            <w:pPr>
+              <w:spacing w:after="0"/>
+            </w:pPr>
+            <w:r>
+              <w:rPr>
+                <w:b w:val="0"/>
+              </w:rPr>
+              <w:t>Explains Docker-based installation, backup, restore, update, LAN access, and optional cloud sync.</w:t>
+            </w:r>
+          </w:p>
+        </w:tc>
+      </w:tr>
+    </w:tbl>
+    <w:p/>
+    <w:p>
+      <w:pPr>
+        <w:pStyle w:val="Heading2"/>
+      </w:pPr>
+      <w:r>
+        <w:t>Microsoft Word Versions</w:t>
+      </w:r>
+    </w:p>
+    <w:p>
+      <w:r>
+        <w:rPr>
+          <w:b w:val="0"/>
+        </w:rPr>
+        <w:t>Microsoft Word .docx copies are available in docs/word/.</w:t>
+      </w:r>
+    </w:p>
+    <w:tbl>
+      <w:tblPr>
+        <w:tblStyle w:val="TableGrid"/>
+        <w:tblW w:type="auto" w:w="0"/>
+        <w:jc w:val="center"/>
+        <w:tblLook w:firstColumn="1" w:firstRow="1" w:lastColumn="0" w:lastRow="0" w:noHBand="0" w:noVBand="1" w:val="04A0"/>
+      </w:tblPr>
+      <w:tblGrid>
+        <w:gridCol w:w="4997"/>
+        <w:gridCol w:w="4997"/>
+      </w:tblGrid>
+      <w:tr>
+        <w:trPr>
+          <w:tblHeader w:val="true"/>
+        </w:trPr>
+        <w:tc>
+          <w:tcPr>
+            <w:tcW w:type="dxa" w:w="4997"/>
+            <w:shd w:fill="D9EAF7"/>
+            <w:tcBorders>
+              <w:top w:val="single" w:sz="4" w:space="0" w:color="B7C9D6"/>
+              <w:left w:val="single" w:sz="4" w:space="0" w:color="B7C9D6"/>
+              <w:bottom w:val="single" w:sz="4" w:space="0" w:color="B7C9D6"/>
+              <w:right w:val="single" w:sz="4" w:space="0" w:color="B7C9D6"/>
+              <w:insideH w:val="single" w:sz="4" w:space="0" w:color="B7C9D6"/>
+              <w:insideV w:val="single" w:sz="4" w:space="0" w:color="B7C9D6"/>
+            </w:tcBorders>
+            <w:vAlign w:val="center"/>
+          </w:tcPr>
+          <w:p>
+            <w:pPr>
+              <w:spacing w:after="0"/>
+            </w:pPr>
+            <w:r>
+              <w:rPr>
+                <w:b/>
+              </w:rPr>
+              <w:t>Word File</w:t>
+            </w:r>
+          </w:p>
+        </w:tc>
+        <w:tc>
+          <w:tcPr>
+            <w:tcW w:type="dxa" w:w="4997"/>
+            <w:shd w:fill="D9EAF7"/>
+            <w:tcBorders>
+              <w:top w:val="single" w:sz="4" w:space="0" w:color="B7C9D6"/>
+              <w:left w:val="single" w:sz="4" w:space="0" w:color="B7C9D6"/>
+              <w:bottom w:val="single" w:sz="4" w:space="0" w:color="B7C9D6"/>
+              <w:right w:val="single" w:sz="4" w:space="0" w:color="B7C9D6"/>
+              <w:insideH w:val="single" w:sz="4" w:space="0" w:color="B7C9D6"/>
+              <w:insideV w:val="single" w:sz="4" w:space="0" w:color="B7C9D6"/>
+            </w:tcBorders>
+            <w:vAlign w:val="center"/>
+          </w:tcPr>
+          <w:p>
+            <w:pPr>
+              <w:spacing w:after="0"/>
+            </w:pPr>
+            <w:r>
+              <w:rPr>
+                <w:b/>
+              </w:rPr>
+              <w:t>Purpose</w:t>
+            </w:r>
+          </w:p>
+        </w:tc>
+      </w:tr>
+      <w:tr>
+        <w:tc>
+          <w:tcPr>
+            <w:tcW w:type="dxa" w:w="4997"/>
+            <w:tcBorders>
+              <w:top w:val="single" w:sz="4" w:space="0" w:color="B7C9D6"/>
+              <w:left w:val="single" w:sz="4" w:space="0" w:color="B7C9D6"/>
+              <w:bottom w:val="single" w:sz="4" w:space="0" w:color="B7C9D6"/>
+              <w:right w:val="single" w:sz="4" w:space="0" w:color="B7C9D6"/>
+              <w:insideH w:val="single" w:sz="4" w:space="0" w:color="B7C9D6"/>
+              <w:insideV w:val="single" w:sz="4" w:space="0" w:color="B7C9D6"/>
+            </w:tcBorders>
+            <w:vAlign w:val="center"/>
+          </w:tcPr>
+          <w:p>
+            <w:pPr>
+              <w:spacing w:after="0"/>
+            </w:pPr>
+            <w:r>
+              <w:rPr>
+                <w:b w:val="0"/>
+              </w:rPr>
+              <w:t>docs/word/RestaurantOS_Documentation_Pack.docx</w:t>
+            </w:r>
+          </w:p>
+        </w:tc>
+        <w:tc>
+          <w:tcPr>
+            <w:tcW w:type="dxa" w:w="4997"/>
+            <w:tcBorders>
+              <w:top w:val="single" w:sz="4" w:space="0" w:color="B7C9D6"/>
+              <w:left w:val="single" w:sz="4" w:space="0" w:color="B7C9D6"/>
+              <w:bottom w:val="single" w:sz="4" w:space="0" w:color="B7C9D6"/>
+              <w:right w:val="single" w:sz="4" w:space="0" w:color="B7C9D6"/>
+              <w:insideH w:val="single" w:sz="4" w:space="0" w:color="B7C9D6"/>
+              <w:insideV w:val="single" w:sz="4" w:space="0" w:color="B7C9D6"/>
+            </w:tcBorders>
+            <w:vAlign w:val="center"/>
+          </w:tcPr>
+          <w:p>
+            <w:pPr>
+              <w:spacing w:after="0"/>
+            </w:pPr>
+            <w:r>
+              <w:rPr>
+                <w:b w:val="0"/>
+              </w:rPr>
+              <w:t>Combined documentation pack in one Word file.</w:t>
+            </w:r>
+          </w:p>
+        </w:tc>
+      </w:tr>
+      <w:tr>
+        <w:tc>
+          <w:tcPr>
+            <w:tcW w:type="dxa" w:w="4997"/>
+            <w:tcBorders>
+              <w:top w:val="single" w:sz="4" w:space="0" w:color="B7C9D6"/>
+              <w:left w:val="single" w:sz="4" w:space="0" w:color="B7C9D6"/>
+              <w:bottom w:val="single" w:sz="4" w:space="0" w:color="B7C9D6"/>
+              <w:right w:val="single" w:sz="4" w:space="0" w:color="B7C9D6"/>
+              <w:insideH w:val="single" w:sz="4" w:space="0" w:color="B7C9D6"/>
+              <w:insideV w:val="single" w:sz="4" w:space="0" w:color="B7C9D6"/>
+            </w:tcBorders>
+            <w:vAlign w:val="center"/>
+          </w:tcPr>
+          <w:p>
+            <w:pPr>
+              <w:spacing w:after="0"/>
+            </w:pPr>
+            <w:r>
+              <w:rPr>
+                <w:b w:val="0"/>
+              </w:rPr>
+              <w:t>docs/word/RestaurantOS_Documentation_Pack_OnPrem.docx</w:t>
+            </w:r>
+          </w:p>
+        </w:tc>
+        <w:tc>
+          <w:tcPr>
+            <w:tcW w:type="dxa" w:w="4997"/>
+            <w:tcBorders>
+              <w:top w:val="single" w:sz="4" w:space="0" w:color="B7C9D6"/>
+              <w:left w:val="single" w:sz="4" w:space="0" w:color="B7C9D6"/>
+              <w:bottom w:val="single" w:sz="4" w:space="0" w:color="B7C9D6"/>
+              <w:right w:val="single" w:sz="4" w:space="0" w:color="B7C9D6"/>
+              <w:insideH w:val="single" w:sz="4" w:space="0" w:color="B7C9D6"/>
+              <w:insideV w:val="single" w:sz="4" w:space="0" w:color="B7C9D6"/>
+            </w:tcBorders>
+            <w:vAlign w:val="center"/>
+          </w:tcPr>
+          <w:p>
+            <w:pPr>
+              <w:spacing w:after="0"/>
+            </w:pPr>
+            <w:r>
+              <w:rPr>
+                <w:b w:val="0"/>
+              </w:rPr>
+              <w:t>Combined documentation pack including the on-premise deployment guide.</w:t>
+            </w:r>
+          </w:p>
+        </w:tc>
+      </w:tr>
+      <w:tr>
+        <w:tc>
+          <w:tcPr>
+            <w:tcW w:type="dxa" w:w="4997"/>
+            <w:tcBorders>
+              <w:top w:val="single" w:sz="4" w:space="0" w:color="B7C9D6"/>
+              <w:left w:val="single" w:sz="4" w:space="0" w:color="B7C9D6"/>
+              <w:bottom w:val="single" w:sz="4" w:space="0" w:color="B7C9D6"/>
+              <w:right w:val="single" w:sz="4" w:space="0" w:color="B7C9D6"/>
+              <w:insideH w:val="single" w:sz="4" w:space="0" w:color="B7C9D6"/>
+              <w:insideV w:val="single" w:sz="4" w:space="0" w:color="B7C9D6"/>
+            </w:tcBorders>
+            <w:vAlign w:val="center"/>
+          </w:tcPr>
+          <w:p>
+            <w:pPr>
+              <w:spacing w:after="0"/>
+            </w:pPr>
+            <w:r>
+              <w:rPr>
+                <w:b w:val="0"/>
+              </w:rPr>
+              <w:t>docs/word/readme.docx</w:t>
+            </w:r>
+          </w:p>
+        </w:tc>
+        <w:tc>
+          <w:tcPr>
+            <w:tcW w:type="dxa" w:w="4997"/>
+            <w:tcBorders>
+              <w:top w:val="single" w:sz="4" w:space="0" w:color="B7C9D6"/>
+              <w:left w:val="single" w:sz="4" w:space="0" w:color="B7C9D6"/>
+              <w:bottom w:val="single" w:sz="4" w:space="0" w:color="B7C9D6"/>
+              <w:right w:val="single" w:sz="4" w:space="0" w:color="B7C9D6"/>
+              <w:insideH w:val="single" w:sz="4" w:space="0" w:color="B7C9D6"/>
+              <w:insideV w:val="single" w:sz="4" w:space="0" w:color="B7C9D6"/>
+            </w:tcBorders>
+            <w:vAlign w:val="center"/>
+          </w:tcPr>
+          <w:p>
+            <w:pPr>
+              <w:spacing w:after="0"/>
+            </w:pPr>
+            <w:r>
+              <w:rPr>
+                <w:b w:val="0"/>
+              </w:rPr>
+              <w:t>Documentation index.</w:t>
+            </w:r>
+          </w:p>
+        </w:tc>
+      </w:tr>
+      <w:tr>
+        <w:tc>
+          <w:tcPr>
+            <w:tcW w:type="dxa" w:w="4997"/>
+            <w:tcBorders>
+              <w:top w:val="single" w:sz="4" w:space="0" w:color="B7C9D6"/>
+              <w:left w:val="single" w:sz="4" w:space="0" w:color="B7C9D6"/>
+              <w:bottom w:val="single" w:sz="4" w:space="0" w:color="B7C9D6"/>
+              <w:right w:val="single" w:sz="4" w:space="0" w:color="B7C9D6"/>
+              <w:insideH w:val="single" w:sz="4" w:space="0" w:color="B7C9D6"/>
+              <w:insideV w:val="single" w:sz="4" w:space="0" w:color="B7C9D6"/>
+            </w:tcBorders>
+            <w:vAlign w:val="center"/>
+          </w:tcPr>
+          <w:p>
+            <w:pPr>
+              <w:spacing w:after="0"/>
+            </w:pPr>
+            <w:r>
+              <w:rPr>
+                <w:b w:val="0"/>
+              </w:rPr>
+              <w:t>docs/word/uat_plan.docx</w:t>
+            </w:r>
+          </w:p>
+        </w:tc>
+        <w:tc>
+          <w:tcPr>
+            <w:tcW w:type="dxa" w:w="4997"/>
+            <w:tcBorders>
+              <w:top w:val="single" w:sz="4" w:space="0" w:color="B7C9D6"/>
+              <w:left w:val="single" w:sz="4" w:space="0" w:color="B7C9D6"/>
+              <w:bottom w:val="single" w:sz="4" w:space="0" w:color="B7C9D6"/>
+              <w:right w:val="single" w:sz="4" w:space="0" w:color="B7C9D6"/>
+              <w:insideH w:val="single" w:sz="4" w:space="0" w:color="B7C9D6"/>
+              <w:insideV w:val="single" w:sz="4" w:space="0" w:color="B7C9D6"/>
+            </w:tcBorders>
+            <w:vAlign w:val="center"/>
+          </w:tcPr>
+          <w:p>
+            <w:pPr>
+              <w:spacing w:after="0"/>
+            </w:pPr>
+            <w:r>
+              <w:rPr>
+                <w:b w:val="0"/>
+              </w:rPr>
+              <w:t>UAT plan.</w:t>
+            </w:r>
+          </w:p>
+        </w:tc>
+      </w:tr>
+      <w:tr>
+        <w:tc>
+          <w:tcPr>
+            <w:tcW w:type="dxa" w:w="4997"/>
+            <w:tcBorders>
+              <w:top w:val="single" w:sz="4" w:space="0" w:color="B7C9D6"/>
+              <w:left w:val="single" w:sz="4" w:space="0" w:color="B7C9D6"/>
+              <w:bottom w:val="single" w:sz="4" w:space="0" w:color="B7C9D6"/>
+              <w:right w:val="single" w:sz="4" w:space="0" w:color="B7C9D6"/>
+              <w:insideH w:val="single" w:sz="4" w:space="0" w:color="B7C9D6"/>
+              <w:insideV w:val="single" w:sz="4" w:space="0" w:color="B7C9D6"/>
+            </w:tcBorders>
+            <w:vAlign w:val="center"/>
+          </w:tcPr>
+          <w:p>
+            <w:pPr>
+              <w:spacing w:after="0"/>
+            </w:pPr>
+            <w:r>
+              <w:rPr>
+                <w:b w:val="0"/>
+              </w:rPr>
+              <w:t>docs/word/user_manual.docx</w:t>
+            </w:r>
+          </w:p>
+        </w:tc>
+        <w:tc>
+          <w:tcPr>
+            <w:tcW w:type="dxa" w:w="4997"/>
+            <w:tcBorders>
+              <w:top w:val="single" w:sz="4" w:space="0" w:color="B7C9D6"/>
+              <w:left w:val="single" w:sz="4" w:space="0" w:color="B7C9D6"/>
+              <w:bottom w:val="single" w:sz="4" w:space="0" w:color="B7C9D6"/>
+              <w:right w:val="single" w:sz="4" w:space="0" w:color="B7C9D6"/>
+              <w:insideH w:val="single" w:sz="4" w:space="0" w:color="B7C9D6"/>
+              <w:insideV w:val="single" w:sz="4" w:space="0" w:color="B7C9D6"/>
+            </w:tcBorders>
+            <w:vAlign w:val="center"/>
+          </w:tcPr>
+          <w:p>
+            <w:pPr>
+              <w:spacing w:after="0"/>
+            </w:pPr>
+            <w:r>
+              <w:rPr>
+                <w:b w:val="0"/>
+              </w:rPr>
+              <w:t>User manual.</w:t>
+            </w:r>
+          </w:p>
+        </w:tc>
+      </w:tr>
+      <w:tr>
+        <w:tc>
+          <w:tcPr>
+            <w:tcW w:type="dxa" w:w="4997"/>
+            <w:tcBorders>
+              <w:top w:val="single" w:sz="4" w:space="0" w:color="B7C9D6"/>
+              <w:left w:val="single" w:sz="4" w:space="0" w:color="B7C9D6"/>
+              <w:bottom w:val="single" w:sz="4" w:space="0" w:color="B7C9D6"/>
+              <w:right w:val="single" w:sz="4" w:space="0" w:color="B7C9D6"/>
+              <w:insideH w:val="single" w:sz="4" w:space="0" w:color="B7C9D6"/>
+              <w:insideV w:val="single" w:sz="4" w:space="0" w:color="B7C9D6"/>
+            </w:tcBorders>
+            <w:vAlign w:val="center"/>
+          </w:tcPr>
+          <w:p>
+            <w:pPr>
+              <w:spacing w:after="0"/>
+            </w:pPr>
+            <w:r>
+              <w:rPr>
+                <w:b w:val="0"/>
+              </w:rPr>
+              <w:t>docs/word/flow_diagrams.docx</w:t>
+            </w:r>
+          </w:p>
+        </w:tc>
+        <w:tc>
+          <w:tcPr>
+            <w:tcW w:type="dxa" w:w="4997"/>
+            <w:tcBorders>
+              <w:top w:val="single" w:sz="4" w:space="0" w:color="B7C9D6"/>
+              <w:left w:val="single" w:sz="4" w:space="0" w:color="B7C9D6"/>
+              <w:bottom w:val="single" w:sz="4" w:space="0" w:color="B7C9D6"/>
+              <w:right w:val="single" w:sz="4" w:space="0" w:color="B7C9D6"/>
+              <w:insideH w:val="single" w:sz="4" w:space="0" w:color="B7C9D6"/>
+              <w:insideV w:val="single" w:sz="4" w:space="0" w:color="B7C9D6"/>
+            </w:tcBorders>
+            <w:vAlign w:val="center"/>
+          </w:tcPr>
+          <w:p>
+            <w:pPr>
+              <w:spacing w:after="0"/>
+            </w:pPr>
+            <w:r>
+              <w:rPr>
+                <w:b w:val="0"/>
+              </w:rPr>
+              <w:t>Flow diagrams document.</w:t>
+            </w:r>
+          </w:p>
+        </w:tc>
+      </w:tr>
+      <w:tr>
+        <w:tc>
+          <w:tcPr>
+            <w:tcW w:type="dxa" w:w="4997"/>
+            <w:tcBorders>
+              <w:top w:val="single" w:sz="4" w:space="0" w:color="B7C9D6"/>
+              <w:left w:val="single" w:sz="4" w:space="0" w:color="B7C9D6"/>
+              <w:bottom w:val="single" w:sz="4" w:space="0" w:color="B7C9D6"/>
+              <w:right w:val="single" w:sz="4" w:space="0" w:color="B7C9D6"/>
+              <w:insideH w:val="single" w:sz="4" w:space="0" w:color="B7C9D6"/>
+              <w:insideV w:val="single" w:sz="4" w:space="0" w:color="B7C9D6"/>
+            </w:tcBorders>
+            <w:vAlign w:val="center"/>
+          </w:tcPr>
+          <w:p>
+            <w:pPr>
+              <w:spacing w:after="0"/>
+            </w:pPr>
+            <w:r>
+              <w:rPr>
+                <w:b w:val="0"/>
+              </w:rPr>
+              <w:t>docs/word/sequence_diagrams.docx</w:t>
+            </w:r>
+          </w:p>
+        </w:tc>
+        <w:tc>
+          <w:tcPr>
+            <w:tcW w:type="dxa" w:w="4997"/>
+            <w:tcBorders>
+              <w:top w:val="single" w:sz="4" w:space="0" w:color="B7C9D6"/>
+              <w:left w:val="single" w:sz="4" w:space="0" w:color="B7C9D6"/>
+              <w:bottom w:val="single" w:sz="4" w:space="0" w:color="B7C9D6"/>
+              <w:right w:val="single" w:sz="4" w:space="0" w:color="B7C9D6"/>
+              <w:insideH w:val="single" w:sz="4" w:space="0" w:color="B7C9D6"/>
+              <w:insideV w:val="single" w:sz="4" w:space="0" w:color="B7C9D6"/>
+            </w:tcBorders>
+            <w:vAlign w:val="center"/>
+          </w:tcPr>
+          <w:p>
+            <w:pPr>
+              <w:spacing w:after="0"/>
+            </w:pPr>
+            <w:r>
+              <w:rPr>
+                <w:b w:val="0"/>
+              </w:rPr>
+              <w:t>Sequence diagrams document.</w:t>
+            </w:r>
+          </w:p>
+        </w:tc>
+      </w:tr>
+      <w:tr>
+        <w:tc>
+          <w:tcPr>
+            <w:tcW w:type="dxa" w:w="4997"/>
+            <w:tcBorders>
+              <w:top w:val="single" w:sz="4" w:space="0" w:color="B7C9D6"/>
+              <w:left w:val="single" w:sz="4" w:space="0" w:color="B7C9D6"/>
+              <w:bottom w:val="single" w:sz="4" w:space="0" w:color="B7C9D6"/>
+              <w:right w:val="single" w:sz="4" w:space="0" w:color="B7C9D6"/>
+              <w:insideH w:val="single" w:sz="4" w:space="0" w:color="B7C9D6"/>
+              <w:insideV w:val="single" w:sz="4" w:space="0" w:color="B7C9D6"/>
+            </w:tcBorders>
+            <w:vAlign w:val="center"/>
+          </w:tcPr>
+          <w:p>
+            <w:pPr>
+              <w:spacing w:after="0"/>
+            </w:pPr>
+            <w:r>
+              <w:rPr>
+                <w:b w:val="0"/>
+              </w:rPr>
+              <w:t>docs/word/system_architecture.docx</w:t>
+            </w:r>
+          </w:p>
+        </w:tc>
+        <w:tc>
+          <w:tcPr>
+            <w:tcW w:type="dxa" w:w="4997"/>
+            <w:tcBorders>
+              <w:top w:val="single" w:sz="4" w:space="0" w:color="B7C9D6"/>
+              <w:left w:val="single" w:sz="4" w:space="0" w:color="B7C9D6"/>
+              <w:bottom w:val="single" w:sz="4" w:space="0" w:color="B7C9D6"/>
+              <w:right w:val="single" w:sz="4" w:space="0" w:color="B7C9D6"/>
+              <w:insideH w:val="single" w:sz="4" w:space="0" w:color="B7C9D6"/>
+              <w:insideV w:val="single" w:sz="4" w:space="0" w:color="B7C9D6"/>
+            </w:tcBorders>
+            <w:vAlign w:val="center"/>
+          </w:tcPr>
+          <w:p>
+            <w:pPr>
+              <w:spacing w:after="0"/>
+            </w:pPr>
+            <w:r>
+              <w:rPr>
+                <w:b w:val="0"/>
+              </w:rPr>
+              <w:t>System architecture document.</w:t>
+            </w:r>
+          </w:p>
+        </w:tc>
+      </w:tr>
+      <w:tr>
+        <w:tc>
+          <w:tcPr>
+            <w:tcW w:type="dxa" w:w="4997"/>
+            <w:tcBorders>
+              <w:top w:val="single" w:sz="4" w:space="0" w:color="B7C9D6"/>
+              <w:left w:val="single" w:sz="4" w:space="0" w:color="B7C9D6"/>
+              <w:bottom w:val="single" w:sz="4" w:space="0" w:color="B7C9D6"/>
+              <w:right w:val="single" w:sz="4" w:space="0" w:color="B7C9D6"/>
+              <w:insideH w:val="single" w:sz="4" w:space="0" w:color="B7C9D6"/>
+              <w:insideV w:val="single" w:sz="4" w:space="0" w:color="B7C9D6"/>
+            </w:tcBorders>
+            <w:vAlign w:val="center"/>
+          </w:tcPr>
+          <w:p>
+            <w:pPr>
+              <w:spacing w:after="0"/>
+            </w:pPr>
+            <w:r>
+              <w:rPr>
+                <w:b w:val="0"/>
+              </w:rPr>
+              <w:t>docs/word/on_premise_deployment.docx</w:t>
+            </w:r>
+          </w:p>
+        </w:tc>
+        <w:tc>
+          <w:tcPr>
+            <w:tcW w:type="dxa" w:w="4997"/>
+            <w:tcBorders>
+              <w:top w:val="single" w:sz="4" w:space="0" w:color="B7C9D6"/>
+              <w:left w:val="single" w:sz="4" w:space="0" w:color="B7C9D6"/>
+              <w:bottom w:val="single" w:sz="4" w:space="0" w:color="B7C9D6"/>
+              <w:right w:val="single" w:sz="4" w:space="0" w:color="B7C9D6"/>
+              <w:insideH w:val="single" w:sz="4" w:space="0" w:color="B7C9D6"/>
+              <w:insideV w:val="single" w:sz="4" w:space="0" w:color="B7C9D6"/>
+            </w:tcBorders>
+            <w:vAlign w:val="center"/>
+          </w:tcPr>
+          <w:p>
+            <w:pPr>
+              <w:spacing w:after="0"/>
+            </w:pPr>
+            <w:r>
+              <w:rPr>
+                <w:b w:val="0"/>
+              </w:rPr>
+              <w:t>On-premise deployment guide.</w:t>
+            </w:r>
+          </w:p>
+        </w:tc>
+      </w:tr>
     </w:tbl>
     <w:p/>
     <w:p>

</xml_diff>